<commit_message>
Tarea 3: retira la referencia y la cita del documento de la tarea
Co-Authored-By: Claude Sonnet 5.5 <noreply@anthropic.com>
Claude-Session: https://claude.ai/code/session_016S2e3FucHCtgupXcPL28A1
</commit_message>
<xml_diff>
--- a/Seguridad de Aplicaciones/Tarea 3/Informe-Tarea3-FinanciaWeb.docx
+++ b/Seguridad de Aplicaciones/Tarea 3/Informe-Tarea3-FinanciaWeb.docx
@@ -2203,7 +2203,7 @@
         <w:rPr>
           <w:lang w:val="es-GT"/>
         </w:rPr>
-        <w:t xml:space="preserve">Elaboración propia con base en el caso de estudio (Dirección de Posgrados FISI, 2026).</w:t>
+        <w:t xml:space="preserve">Elaboración propia con base en la descripción del caso de estudio.</w:t>
       </w:r>
     </w:p>
     <w:p>
@@ -8194,34 +8194,6 @@
         <w:t xml:space="preserve">Referencias</w:t>
       </w:r>
       <w:bookmarkEnd w:id="112"/>
-    </w:p>
-    <w:p>
-      <w:pPr>
-        <w:ind w:left="720" w:hanging="720"/>
-        <w:jc w:val="left"/>
-        <w:rPr>
-          <w:lang w:val="es-GT"/>
-        </w:rPr>
-      </w:pPr>
-      <w:r>
-        <w:rPr>
-          <w:lang w:val="es-GT"/>
-        </w:rPr>
-        <w:t xml:space="preserve">Dirección de Posgrados FISI, Universidad Mariano Gálvez de Guatemala. (2026). </w:t>
-      </w:r>
-      <w:r>
-        <w:rPr>
-          <w:i/>
-          <w:lang w:val="es-GT"/>
-        </w:rPr>
-        <w:t xml:space="preserve">Tarea Semana 3: Rediseño seguro de una aplicación aplicando OWASP ASVS</w:t>
-      </w:r>
-      <w:r>
-        <w:rPr>
-          <w:lang w:val="es-GT"/>
-        </w:rPr>
-        <w:t xml:space="preserve"> [Enunciado de la tarea]. Seguridad en Aplicaciones (093-013), Maestría en Seguridad Informática.</w:t>
-      </w:r>
     </w:p>
     <w:p>
       <w:pPr>

</xml_diff>